<commit_message>
Restructuring for first submission
Moved Acknowledgments and Data Availability from title page to just before References. Moved funding and other info that needs to be entered in the submission system to a separate document
</commit_message>
<xml_diff>
--- a/drafts/paRsynth_cover_letter.docx
+++ b/drafts/paRsynth_cover_letter.docx
@@ -31,7 +31,7 @@
           <w:sz w:val="24"/>
           <w:szCs w:val="24"/>
         </w:rPr>
-        <w:t>5</w:t>
+        <w:t>9</w:t>
       </w:r>
       <w:r>
         <w:rPr>
@@ -768,25 +768,7 @@
           <w:sz w:val="24"/>
           <w:szCs w:val="24"/>
         </w:rPr>
-        <w:t xml:space="preserve">by </w:t>
-      </w:r>
-      <w:proofErr w:type="spellStart"/>
-      <w:r>
-        <w:rPr>
-          <w:rFonts w:ascii="Arial" w:hAnsi="Arial"/>
-          <w:sz w:val="24"/>
-          <w:szCs w:val="24"/>
-        </w:rPr>
-        <w:t>sonifying</w:t>
-      </w:r>
-      <w:proofErr w:type="spellEnd"/>
-      <w:r>
-        <w:rPr>
-          <w:rFonts w:ascii="Arial" w:hAnsi="Arial"/>
-          <w:sz w:val="24"/>
-          <w:szCs w:val="24"/>
-        </w:rPr>
-        <w:t xml:space="preserve"> character strings to produce </w:t>
+        <w:t xml:space="preserve">by sonifying character strings to produce </w:t>
       </w:r>
       <w:r>
         <w:rPr>
@@ -1013,15 +995,7 @@
           <w:sz w:val="24"/>
           <w:szCs w:val="24"/>
         </w:rPr>
-        <w:t>spectrographic cross-correlation</w:t>
-      </w:r>
-      <w:r>
-        <w:rPr>
-          <w:rFonts w:ascii="Arial" w:hAnsi="Arial"/>
-          <w:sz w:val="24"/>
-          <w:szCs w:val="24"/>
-        </w:rPr>
-        <w:t xml:space="preserve">, </w:t>
+        <w:t xml:space="preserve">spectrographic cross-correlation, </w:t>
       </w:r>
       <w:r>
         <w:rPr>
@@ -1329,15 +1303,7 @@
           <w:sz w:val="24"/>
           <w:szCs w:val="24"/>
         </w:rPr>
-        <w:t xml:space="preserve"> with animals</w:t>
-      </w:r>
-      <w:r>
-        <w:rPr>
-          <w:rFonts w:ascii="Arial" w:hAnsi="Arial"/>
-          <w:sz w:val="24"/>
-          <w:szCs w:val="24"/>
-        </w:rPr>
-        <w:t xml:space="preserve">. </w:t>
+        <w:t xml:space="preserve"> with animals. </w:t>
       </w:r>
       <w:r>
         <w:rPr>
@@ -1425,15 +1391,7 @@
           <w:sz w:val="24"/>
           <w:szCs w:val="24"/>
         </w:rPr>
-        <w:t>We anticipate that this</w:t>
-      </w:r>
-      <w:r>
-        <w:rPr>
-          <w:rFonts w:ascii="Arial" w:hAnsi="Arial"/>
-          <w:sz w:val="24"/>
-          <w:szCs w:val="24"/>
-        </w:rPr>
-        <w:t xml:space="preserve"> </w:t>
+        <w:t xml:space="preserve">We anticipate that this </w:t>
       </w:r>
       <w:r>
         <w:rPr>
@@ -1737,438 +1695,13 @@
         <w:spacing w:after="0"/>
         <w:rPr>
           <w:rFonts w:ascii="Arial" w:hAnsi="Arial"/>
-          <w:u w:val="single"/>
-        </w:rPr>
-      </w:pPr>
-    </w:p>
-    <w:p>
-      <w:pPr>
-        <w:spacing w:after="0"/>
-        <w:rPr>
-          <w:rFonts w:ascii="Arial" w:hAnsi="Arial"/>
-          <w:sz w:val="24"/>
-          <w:szCs w:val="24"/>
-          <w:u w:val="single"/>
-        </w:rPr>
-      </w:pPr>
-      <w:r>
-        <w:rPr>
-          <w:rFonts w:ascii="Arial" w:hAnsi="Arial"/>
-          <w:sz w:val="24"/>
-          <w:szCs w:val="24"/>
-          <w:u w:val="single"/>
-        </w:rPr>
-        <w:t>Potential Reviewers</w:t>
-      </w:r>
-    </w:p>
-    <w:p>
-      <w:pPr>
-        <w:spacing w:after="0"/>
-        <w:rPr>
-          <w:rFonts w:ascii="Arial" w:hAnsi="Arial"/>
-          <w:sz w:val="24"/>
-          <w:szCs w:val="24"/>
-        </w:rPr>
-      </w:pPr>
-    </w:p>
-    <w:p>
-      <w:pPr>
-        <w:spacing w:after="0"/>
-        <w:rPr>
-          <w:rFonts w:ascii="Arial" w:hAnsi="Arial"/>
-          <w:b/>
-          <w:bCs/>
-          <w:sz w:val="24"/>
-          <w:szCs w:val="24"/>
-        </w:rPr>
-      </w:pPr>
-      <w:r>
-        <w:rPr>
-          <w:rFonts w:ascii="Arial" w:hAnsi="Arial"/>
-          <w:b/>
-          <w:bCs/>
-          <w:sz w:val="24"/>
-          <w:szCs w:val="24"/>
-        </w:rPr>
-        <w:t xml:space="preserve">Nicole </w:t>
-      </w:r>
-      <w:proofErr w:type="spellStart"/>
-      <w:r>
-        <w:rPr>
-          <w:rFonts w:ascii="Arial" w:hAnsi="Arial"/>
-          <w:b/>
-          <w:bCs/>
-          <w:sz w:val="24"/>
-          <w:szCs w:val="24"/>
-        </w:rPr>
-        <w:t>Creanza</w:t>
-      </w:r>
-      <w:proofErr w:type="spellEnd"/>
-    </w:p>
-    <w:p>
-      <w:pPr>
-        <w:spacing w:after="0"/>
-        <w:rPr>
-          <w:rFonts w:ascii="Arial" w:hAnsi="Arial"/>
-          <w:sz w:val="24"/>
-          <w:szCs w:val="24"/>
-        </w:rPr>
-      </w:pPr>
-      <w:r>
-        <w:rPr>
-          <w:rFonts w:ascii="Arial" w:hAnsi="Arial"/>
-          <w:sz w:val="24"/>
-          <w:szCs w:val="24"/>
-        </w:rPr>
-        <w:t>Assistant Professor</w:t>
-      </w:r>
-    </w:p>
-    <w:p>
-      <w:pPr>
-        <w:spacing w:after="0"/>
-        <w:rPr>
-          <w:rFonts w:ascii="Arial" w:hAnsi="Arial"/>
-          <w:sz w:val="24"/>
-          <w:szCs w:val="24"/>
-        </w:rPr>
-      </w:pPr>
-      <w:r>
-        <w:rPr>
-          <w:rFonts w:ascii="Arial" w:hAnsi="Arial"/>
-          <w:sz w:val="24"/>
-          <w:szCs w:val="24"/>
-        </w:rPr>
-        <w:t>Biological Sciences Department</w:t>
-      </w:r>
-    </w:p>
-    <w:p>
-      <w:pPr>
-        <w:spacing w:after="0"/>
-        <w:rPr>
-          <w:rFonts w:ascii="Arial" w:hAnsi="Arial"/>
-          <w:sz w:val="24"/>
-          <w:szCs w:val="24"/>
-        </w:rPr>
-      </w:pPr>
-      <w:r>
-        <w:rPr>
-          <w:rFonts w:ascii="Arial" w:hAnsi="Arial"/>
-          <w:sz w:val="24"/>
-          <w:szCs w:val="24"/>
-        </w:rPr>
-        <w:t xml:space="preserve">Vanderbilt University, </w:t>
-      </w:r>
-      <w:r>
-        <w:rPr>
-          <w:rFonts w:ascii="Arial" w:hAnsi="Arial"/>
-          <w:sz w:val="24"/>
-          <w:szCs w:val="24"/>
-        </w:rPr>
-        <w:t>Nashville, Tennessee, USA</w:t>
-      </w:r>
-    </w:p>
-    <w:p>
-      <w:pPr>
-        <w:spacing w:after="160"/>
-        <w:rPr>
-          <w:rFonts w:ascii="Arial" w:hAnsi="Arial"/>
-          <w:sz w:val="24"/>
-          <w:szCs w:val="24"/>
-        </w:rPr>
-      </w:pPr>
-      <w:hyperlink r:id="rId9" w:history="1">
-        <w:r>
-          <w:rPr>
-            <w:rStyle w:val="Hyperlink"/>
-            <w:rFonts w:ascii="Arial" w:hAnsi="Arial"/>
-            <w:sz w:val="24"/>
-            <w:szCs w:val="24"/>
-          </w:rPr>
-          <w:t>nicole.creanza@vanderbilt.edu</w:t>
-        </w:r>
-      </w:hyperlink>
-    </w:p>
-    <w:p>
-      <w:pPr>
-        <w:spacing w:after="0"/>
-        <w:rPr>
-          <w:rFonts w:ascii="Arial" w:hAnsi="Arial"/>
-          <w:b/>
-          <w:bCs/>
-          <w:sz w:val="24"/>
-          <w:szCs w:val="24"/>
-        </w:rPr>
-      </w:pPr>
-      <w:r>
-        <w:rPr>
-          <w:rFonts w:ascii="Arial" w:hAnsi="Arial"/>
-          <w:b/>
-          <w:bCs/>
-          <w:sz w:val="24"/>
-          <w:szCs w:val="24"/>
-        </w:rPr>
-        <w:t>A</w:t>
-      </w:r>
-      <w:r>
-        <w:rPr>
-          <w:rFonts w:ascii="Arial" w:hAnsi="Arial"/>
-          <w:b/>
-          <w:bCs/>
-          <w:sz w:val="24"/>
-          <w:szCs w:val="24"/>
-        </w:rPr>
-        <w:t>n</w:t>
-      </w:r>
-      <w:r>
-        <w:rPr>
-          <w:rFonts w:ascii="Arial" w:hAnsi="Arial"/>
-          <w:b/>
-          <w:bCs/>
-          <w:sz w:val="24"/>
-          <w:szCs w:val="24"/>
-        </w:rPr>
-        <w:t>drey Anikin</w:t>
-      </w:r>
-    </w:p>
-    <w:p>
-      <w:pPr>
-        <w:spacing w:after="0"/>
-        <w:rPr>
-          <w:rFonts w:ascii="Arial" w:hAnsi="Arial"/>
-          <w:sz w:val="24"/>
-          <w:szCs w:val="24"/>
-        </w:rPr>
-      </w:pPr>
-      <w:r>
-        <w:rPr>
-          <w:rFonts w:ascii="Arial" w:hAnsi="Arial"/>
-          <w:sz w:val="24"/>
-          <w:szCs w:val="24"/>
-        </w:rPr>
-        <w:t>Associate Professor</w:t>
-      </w:r>
-    </w:p>
-    <w:p>
-      <w:pPr>
-        <w:spacing w:after="0"/>
-        <w:rPr>
-          <w:rFonts w:ascii="Arial" w:hAnsi="Arial"/>
-          <w:color w:val="000000"/>
-          <w:sz w:val="24"/>
-          <w:szCs w:val="24"/>
-          <w:shd w:val="clear" w:color="auto" w:fill="FFFFFF"/>
-        </w:rPr>
-      </w:pPr>
-      <w:r>
-        <w:rPr>
-          <w:rFonts w:ascii="Arial" w:hAnsi="Arial"/>
-          <w:color w:val="000000"/>
-          <w:sz w:val="24"/>
-          <w:szCs w:val="24"/>
-          <w:shd w:val="clear" w:color="auto" w:fill="FFFFFF"/>
-        </w:rPr>
-        <w:t xml:space="preserve">Department of Philosophy </w:t>
-      </w:r>
-    </w:p>
-    <w:p>
-      <w:pPr>
-        <w:spacing w:after="0"/>
-        <w:rPr>
-          <w:rFonts w:ascii="Arial" w:hAnsi="Arial"/>
-          <w:color w:val="000000"/>
-          <w:sz w:val="24"/>
-          <w:szCs w:val="24"/>
-          <w:shd w:val="clear" w:color="auto" w:fill="FFFFFF"/>
-        </w:rPr>
-      </w:pPr>
-      <w:r>
-        <w:rPr>
-          <w:rFonts w:ascii="Arial" w:hAnsi="Arial"/>
-          <w:color w:val="000000"/>
-          <w:sz w:val="24"/>
-          <w:szCs w:val="24"/>
-          <w:shd w:val="clear" w:color="auto" w:fill="FFFFFF"/>
-        </w:rPr>
-        <w:t>Lund University Cognitive Science</w:t>
-      </w:r>
-      <w:r>
-        <w:rPr>
-          <w:rFonts w:ascii="Arial" w:hAnsi="Arial"/>
-          <w:color w:val="000000"/>
-          <w:sz w:val="24"/>
-          <w:szCs w:val="24"/>
-          <w:shd w:val="clear" w:color="auto" w:fill="FFFFFF"/>
-        </w:rPr>
-        <w:t>,</w:t>
-      </w:r>
-      <w:r>
-        <w:rPr>
-          <w:rFonts w:ascii="Arial" w:hAnsi="Arial"/>
-          <w:color w:val="000000"/>
-          <w:sz w:val="24"/>
-          <w:szCs w:val="24"/>
-          <w:shd w:val="clear" w:color="auto" w:fill="FFFFFF"/>
-        </w:rPr>
-        <w:t xml:space="preserve"> </w:t>
-      </w:r>
-      <w:r>
-        <w:rPr>
-          <w:rFonts w:ascii="Arial" w:hAnsi="Arial"/>
-          <w:color w:val="000000"/>
-          <w:sz w:val="24"/>
-          <w:szCs w:val="24"/>
-          <w:shd w:val="clear" w:color="auto" w:fill="FFFFFF"/>
-        </w:rPr>
-        <w:t xml:space="preserve">Lund, </w:t>
-      </w:r>
-      <w:r>
-        <w:rPr>
-          <w:rFonts w:ascii="Arial" w:hAnsi="Arial"/>
-          <w:color w:val="000000"/>
-          <w:sz w:val="24"/>
-          <w:szCs w:val="24"/>
-          <w:shd w:val="clear" w:color="auto" w:fill="FFFFFF"/>
-        </w:rPr>
-        <w:t>Sweden</w:t>
-      </w:r>
-    </w:p>
-    <w:p>
-      <w:pPr>
-        <w:spacing w:after="160"/>
-        <w:rPr>
-          <w:rFonts w:ascii="Arial" w:hAnsi="Arial"/>
-          <w:sz w:val="24"/>
-          <w:szCs w:val="24"/>
-        </w:rPr>
-      </w:pPr>
-      <w:hyperlink r:id="rId10" w:history="1">
-        <w:r>
-          <w:rPr>
-            <w:rStyle w:val="Hyperlink"/>
-            <w:rFonts w:ascii="Arial" w:hAnsi="Arial"/>
-            <w:sz w:val="24"/>
-            <w:szCs w:val="24"/>
-            <w:shd w:val="clear" w:color="auto" w:fill="FFFFFF"/>
-          </w:rPr>
-          <w:t>andrey.anikin@cogsci.se</w:t>
-        </w:r>
-      </w:hyperlink>
-    </w:p>
-    <w:p>
-      <w:pPr>
-        <w:spacing w:after="0"/>
-        <w:rPr>
-          <w:rFonts w:ascii="Arial" w:hAnsi="Arial"/>
-          <w:b/>
-          <w:bCs/>
-          <w:sz w:val="24"/>
-          <w:szCs w:val="24"/>
-        </w:rPr>
-      </w:pPr>
-      <w:r>
-        <w:rPr>
-          <w:rFonts w:ascii="Arial" w:hAnsi="Arial"/>
-          <w:b/>
-          <w:bCs/>
-          <w:sz w:val="24"/>
-          <w:szCs w:val="24"/>
-        </w:rPr>
-        <w:t>Mason Youngblood</w:t>
-      </w:r>
-    </w:p>
-    <w:p>
-      <w:pPr>
-        <w:spacing w:after="0"/>
-        <w:rPr>
-          <w:rFonts w:ascii="Arial" w:hAnsi="Arial"/>
-          <w:sz w:val="24"/>
-          <w:szCs w:val="24"/>
-        </w:rPr>
-      </w:pPr>
-      <w:r>
-        <w:rPr>
-          <w:rFonts w:ascii="Arial" w:hAnsi="Arial"/>
-          <w:sz w:val="24"/>
-          <w:szCs w:val="24"/>
-        </w:rPr>
-        <w:t>Postdoctoral Fellow</w:t>
-      </w:r>
-    </w:p>
-    <w:p>
-      <w:pPr>
-        <w:spacing w:after="0"/>
-        <w:rPr>
-          <w:rFonts w:ascii="Arial" w:hAnsi="Arial"/>
-          <w:sz w:val="24"/>
-          <w:szCs w:val="24"/>
-        </w:rPr>
-      </w:pPr>
-      <w:r>
-        <w:rPr>
-          <w:rFonts w:ascii="Arial" w:hAnsi="Arial"/>
-          <w:sz w:val="24"/>
-          <w:szCs w:val="24"/>
-        </w:rPr>
-        <w:t>Institute for Advanced Computational Science</w:t>
-      </w:r>
-    </w:p>
-    <w:p>
-      <w:pPr>
-        <w:spacing w:after="0"/>
-        <w:rPr>
-          <w:rFonts w:ascii="Arial" w:hAnsi="Arial"/>
-          <w:sz w:val="24"/>
-          <w:szCs w:val="24"/>
-        </w:rPr>
-      </w:pPr>
-      <w:r>
-        <w:rPr>
-          <w:rFonts w:ascii="Arial" w:hAnsi="Arial"/>
-          <w:sz w:val="24"/>
-          <w:szCs w:val="24"/>
-        </w:rPr>
-        <w:t xml:space="preserve">Stony Brook University, </w:t>
-      </w:r>
-      <w:r>
-        <w:rPr>
-          <w:rFonts w:ascii="Arial" w:hAnsi="Arial"/>
-          <w:sz w:val="24"/>
-          <w:szCs w:val="24"/>
-        </w:rPr>
-        <w:t xml:space="preserve">Stony Brook, </w:t>
-      </w:r>
-      <w:r>
-        <w:rPr>
-          <w:rFonts w:ascii="Arial" w:hAnsi="Arial"/>
-          <w:sz w:val="24"/>
-          <w:szCs w:val="24"/>
-        </w:rPr>
-        <w:t>New York, USA</w:t>
-      </w:r>
-    </w:p>
-    <w:p>
-      <w:pPr>
-        <w:spacing w:after="0"/>
-        <w:rPr>
-          <w:rFonts w:ascii="Arial" w:hAnsi="Arial"/>
-          <w:sz w:val="24"/>
-          <w:szCs w:val="24"/>
-        </w:rPr>
-      </w:pPr>
-      <w:hyperlink r:id="rId11" w:history="1">
-        <w:r>
-          <w:rPr>
-            <w:rStyle w:val="Hyperlink"/>
-            <w:rFonts w:ascii="Arial" w:hAnsi="Arial"/>
-            <w:sz w:val="24"/>
-            <w:szCs w:val="24"/>
-          </w:rPr>
-          <w:t>masonyoungblood@gmail.com</w:t>
-        </w:r>
-      </w:hyperlink>
+          <w:sz w:val="24"/>
+          <w:szCs w:val="24"/>
+        </w:rPr>
+      </w:pPr>
     </w:p>
     <w:sectPr>
-      <w:headerReference w:type="first" r:id="rId12"/>
+      <w:headerReference w:type="first" r:id="rId9"/>
       <w:pgSz w:w="12240" w:h="15840" w:code="1"/>
       <w:pgMar w:top="1800" w:right="1800" w:bottom="1800" w:left="2635" w:header="720" w:footer="720" w:gutter="0"/>
       <w:cols w:space="720"/>

</xml_diff>

<commit_message>
Editor options and manuscript title
</commit_message>
<xml_diff>
--- a/drafts/paRsynth_cover_letter.docx
+++ b/drafts/paRsynth_cover_letter.docx
@@ -89,25 +89,7 @@
           <w:sz w:val="24"/>
           <w:szCs w:val="24"/>
         </w:rPr>
-        <w:t xml:space="preserve">Dr. Mac </w:t>
-      </w:r>
-      <w:proofErr w:type="spellStart"/>
-      <w:r>
-        <w:rPr>
-          <w:rFonts w:ascii="Arial" w:hAnsi="Arial"/>
-          <w:sz w:val="24"/>
-          <w:szCs w:val="24"/>
-        </w:rPr>
-        <w:t>Gabhann</w:t>
-      </w:r>
-      <w:proofErr w:type="spellEnd"/>
-      <w:r>
-        <w:rPr>
-          <w:rFonts w:ascii="Arial" w:hAnsi="Arial"/>
-          <w:sz w:val="24"/>
-          <w:szCs w:val="24"/>
-        </w:rPr>
-        <w:t xml:space="preserve"> and </w:t>
+        <w:t xml:space="preserve">Dr. Mac Gabhann and </w:t>
       </w:r>
       <w:r>
         <w:rPr>
@@ -164,26 +146,16 @@
       <w:r>
         <w:rPr>
           <w:rFonts w:ascii="Arial" w:hAnsi="Arial"/>
-          <w:sz w:val="24"/>
-          <w:szCs w:val="24"/>
-        </w:rPr>
-        <w:t>Synthetic frequency-modulated voc</w:t>
-      </w:r>
-      <w:r>
-        <w:rPr>
-          <w:rFonts w:ascii="Arial" w:hAnsi="Arial"/>
-          <w:sz w:val="24"/>
-          <w:szCs w:val="24"/>
-        </w:rPr>
-        <w:t>a</w:t>
-      </w:r>
-      <w:r>
-        <w:rPr>
-          <w:rFonts w:ascii="Arial" w:hAnsi="Arial"/>
-          <w:sz w:val="24"/>
-          <w:szCs w:val="24"/>
-        </w:rPr>
-        <w:t>lizations to test identity information detection”</w:t>
+        </w:rPr>
+        <w:t>Sonifying character strings into synthetic vocal identity signals and testing identity information detection</w:t>
+      </w:r>
+      <w:r>
+        <w:rPr>
+          <w:rFonts w:ascii="Arial" w:hAnsi="Arial"/>
+          <w:sz w:val="24"/>
+          <w:szCs w:val="24"/>
+        </w:rPr>
+        <w:t>”</w:t>
       </w:r>
       <w:r>
         <w:rPr>
@@ -1391,7 +1363,15 @@
           <w:sz w:val="24"/>
           <w:szCs w:val="24"/>
         </w:rPr>
-        <w:t xml:space="preserve">We anticipate that this </w:t>
+        <w:t xml:space="preserve">We </w:t>
+      </w:r>
+      <w:r>
+        <w:rPr>
+          <w:rFonts w:ascii="Arial" w:hAnsi="Arial"/>
+          <w:sz w:val="24"/>
+          <w:szCs w:val="24"/>
+        </w:rPr>
+        <w:t xml:space="preserve">anticipate that this </w:t>
       </w:r>
       <w:r>
         <w:rPr>
@@ -1479,7 +1459,115 @@
           <w:sz w:val="24"/>
           <w:szCs w:val="24"/>
         </w:rPr>
-        <w:t xml:space="preserve">. </w:t>
+        <w:t>.</w:t>
+      </w:r>
+      <w:r>
+        <w:rPr>
+          <w:rFonts w:ascii="Arial" w:hAnsi="Arial"/>
+          <w:sz w:val="24"/>
+          <w:szCs w:val="24"/>
+        </w:rPr>
+        <w:t xml:space="preserve"> Finally, </w:t>
+      </w:r>
+      <w:r>
+        <w:rPr>
+          <w:rFonts w:ascii="Arial" w:hAnsi="Arial"/>
+          <w:sz w:val="24"/>
+          <w:szCs w:val="24"/>
+        </w:rPr>
+        <w:t>t</w:t>
+      </w:r>
+      <w:r>
+        <w:rPr>
+          <w:rFonts w:ascii="Arial" w:hAnsi="Arial"/>
+          <w:sz w:val="24"/>
+          <w:szCs w:val="24"/>
+        </w:rPr>
+        <w:t>his manuscript could be handled by</w:t>
+      </w:r>
+      <w:r>
+        <w:rPr>
+          <w:rFonts w:ascii="Arial" w:hAnsi="Arial"/>
+          <w:sz w:val="24"/>
+          <w:szCs w:val="24"/>
+        </w:rPr>
+        <w:t xml:space="preserve"> Associate Editors</w:t>
+      </w:r>
+      <w:r>
+        <w:rPr>
+          <w:rFonts w:ascii="Arial" w:hAnsi="Arial"/>
+          <w:sz w:val="24"/>
+          <w:szCs w:val="24"/>
+        </w:rPr>
+        <w:t xml:space="preserve"> with expertise in behavioral ecology, language, and learning, including</w:t>
+      </w:r>
+      <w:r>
+        <w:rPr>
+          <w:rFonts w:ascii="Arial" w:hAnsi="Arial"/>
+          <w:sz w:val="24"/>
+          <w:szCs w:val="24"/>
+        </w:rPr>
+        <w:t xml:space="preserve"> </w:t>
+      </w:r>
+      <w:r>
+        <w:rPr>
+          <w:rFonts w:ascii="Arial" w:hAnsi="Arial"/>
+          <w:sz w:val="24"/>
+          <w:szCs w:val="24"/>
+        </w:rPr>
+        <w:t xml:space="preserve">Drs. </w:t>
+      </w:r>
+      <w:r>
+        <w:rPr>
+          <w:rStyle w:val="Strong"/>
+          <w:rFonts w:ascii="Arial" w:hAnsi="Arial"/>
+          <w:b w:val="0"/>
+          <w:bCs w:val="0"/>
+          <w:color w:val="202020"/>
+          <w:sz w:val="24"/>
+          <w:szCs w:val="24"/>
+          <w:shd w:val="clear" w:color="auto" w:fill="FFFFFF"/>
+        </w:rPr>
+        <w:t>Chaitanya</w:t>
+      </w:r>
+      <w:r>
+        <w:rPr>
+          <w:rStyle w:val="Strong"/>
+          <w:rFonts w:ascii="Arial" w:hAnsi="Arial"/>
+          <w:b w:val="0"/>
+          <w:bCs w:val="0"/>
+          <w:color w:val="202020"/>
+          <w:sz w:val="24"/>
+          <w:szCs w:val="24"/>
+          <w:shd w:val="clear" w:color="auto" w:fill="FFFFFF"/>
+        </w:rPr>
+        <w:t xml:space="preserve"> </w:t>
+      </w:r>
+      <w:r>
+        <w:rPr>
+          <w:rStyle w:val="Strong"/>
+          <w:rFonts w:ascii="Arial" w:hAnsi="Arial"/>
+          <w:b w:val="0"/>
+          <w:bCs w:val="0"/>
+          <w:color w:val="202020"/>
+          <w:sz w:val="24"/>
+          <w:szCs w:val="24"/>
+          <w:shd w:val="clear" w:color="auto" w:fill="FFFFFF"/>
+        </w:rPr>
+        <w:t>Gokhale or Barbara Webb</w:t>
+      </w:r>
+      <w:r>
+        <w:rPr>
+          <w:rStyle w:val="Strong"/>
+          <w:rFonts w:ascii="Arial" w:hAnsi="Arial"/>
+          <w:b w:val="0"/>
+          <w:bCs w:val="0"/>
+          <w:color w:val="202020"/>
+          <w:sz w:val="24"/>
+          <w:szCs w:val="24"/>
+          <w:shd w:val="clear" w:color="auto" w:fill="FFFFFF"/>
+        </w:rPr>
+        <w:t>.</w:t>
       </w:r>
     </w:p>
     <w:p>
@@ -2173,19 +2261,8 @@
                               <w:sz w:val="14"/>
                               <w:szCs w:val="14"/>
                             </w:rPr>
-                            <w:t xml:space="preserve">Natural Science </w:t>
+                            <w:t>Natural Science Bldg</w:t>
                           </w:r>
-                          <w:proofErr w:type="spellStart"/>
-                          <w:r>
-                            <w:rPr>
-                              <w:rFonts w:ascii="Arial" w:hAnsi="Arial"/>
-                              <w:color w:val="000000"/>
-                              <w:sz w:val="14"/>
-                              <w:szCs w:val="14"/>
-                            </w:rPr>
-                            <w:t>Bldg</w:t>
-                          </w:r>
-                          <w:proofErr w:type="spellEnd"/>
                         </w:p>
                         <w:p>
                           <w:pPr>
@@ -3798,6 +3875,17 @@
       <w:szCs w:val="22"/>
     </w:rPr>
   </w:style>
+  <w:style w:type="character" w:styleId="Strong">
+    <w:name w:val="Strong"/>
+    <w:basedOn w:val="DefaultParagraphFont"/>
+    <w:uiPriority w:val="22"/>
+    <w:qFormat/>
+    <w:rsid w:val="00507E87"/>
+    <w:rPr>
+      <w:b/>
+      <w:bCs/>
+    </w:rPr>
+  </w:style>
 </w:styles>
 </file>
 

</xml_diff>